<commit_message>
Word: tables and captions only; Table 5 without the pipeline-recall rows
Co-Authored-By: Claude Opus 5.5 <noreply@anthropic.com>
</commit_message>
<xml_diff>
--- a/docs/GSV_pipeline_tables.docx
+++ b/docs/GSV_pipeline_tables.docx
@@ -6,37 +6,9 @@
       <w:r>
         <w:rPr>
           <w:b/>
-          <w:sz w:val="28"/>
-        </w:rPr>
-        <w:t>파이프라인 결과 — signboard detection → word-box detection → OCR → OCR + VLM correction</w:t>
-      </w:r>
-    </w:p>
-    <w:p>
-      <w:r>
-        <w:rPr>
-          <w:i/>
-          <w:sz w:val="17"/>
-        </w:rPr>
-        <w:t>배포 구성: YOLO26x signboard detector → crop → 학습한 YOLO26x word detector (conf 0.01) → line-strip merge (y_tol 0.04, pad 0.04) → SVTRv2-B recognizer → Gemma 4 31B post-OCR correction (fix 모드: SVTRv2 결과 + 간판 이미지) → Gemma 4 31B semantic tagging. recognition pass 는 SVTRv2 1회뿐입니다(다른 인식기의 후보를 쓰는 fixcand 는 PaddleOCR 를 3회 더 돌려야 해서 배포에 쓰지 않고, 표 4 의 비교 실험으로만 둡니다). 모든 수치는 이 코드를 실제로 실행해 얻은 값이며, “—”는 측정하지 않은 칸으로 다른 구성의 값이나 환산값으로 채우지 않았습니다.</w:t>
-      </w:r>
-    </w:p>
-    <w:p/>
-    <w:p>
-      <w:r>
-        <w:rPr>
-          <w:b/>
           <w:sz w:val="22"/>
         </w:rPr>
         <w:t>Table 1. Signboard detection by model and region (AP@0.5)</w:t>
-      </w:r>
-    </w:p>
-    <w:p>
-      <w:r>
-        <w:rPr>
-          <w:i/>
-          <w:sz w:val="17"/>
-        </w:rPr>
-        <w:t>모든 모델에 같은 group-aware 5-fold split 과 같은 AP@0.5 구현을 적용했습니다. group-aware 란 같은 가게(storefront)가 찍힌 사진을 한 fold 에 묶어 train 과 validation 에 걸치지 않게 한 것으로, 같은 간판을 외워서 맞히는 leakage 를 막습니다. 값은 각 fold 의 out-of-fold 예측을 GSV 사진 298장 전체에 대해 pooling 해 계산한 것입니다.</w:t>
       </w:r>
     </w:p>
     <w:tbl>
@@ -466,15 +438,6 @@
           <w:sz w:val="22"/>
         </w:rPr>
         <w:t>Table 2. Signboard detection, word-box detection, and the two chained — all in AP@0.5</w:t>
-      </w:r>
-    </w:p>
-    <w:p>
-      <w:r>
-        <w:rPr>
-          <w:i/>
-          <w:sz w:val="17"/>
-        </w:rPr>
-        <w:t>표 2 는 간판 검출이 단어 검출에 끼치는 손실을 보기 위한 표입니다. 모든 열이 AP@0.5 입니다. Signboard AP 는 표 1 과 같은 값입니다. Word-box AP (AI Hub) 는 검출기를 학습한 AI Hub signboard_v3 hold-out(2,706장 / 7,756 word box)에서 잰 값이고, 나머지 세 열은 이번 리비전에서 라벨링한 GSV word-box ground truth 로 잽니다 — 표 1 과 같은 GSV 사진 298장, GT signboard 453개, word box 1,467개. GSV 두 열은 한 스크립트(detection/eval_wordbox_chain_gsv.py)에서 간판 박스의 출처만 바꿔 계산합니다: “GT signboards” 는 사람이 그린 간판 박스, “Chained” 는 표 1 의 검출기(YOLO26x, group-aware 5-fold)의 out-of-fold 예측(conf 0.25) — 각 사진은 그 사진을 학습하지 않은 fold 의 모델로 검출합니다. 두 경우 모두 같은 규칙으로 간판을 자르고(6% 여유, 긴 변 1,400 px), 같은 word detector 를 돌려, 원본 사진 좌표로 되돌린 뒤 사진 단위 NMS 후 채점합니다. 따라서 두 열의 차이(YOLO26x 0.892 → 0.718)가 곧 간판 검출이 깎는 몫입니다. 독립 검산으로, word GT 중 검출된 간판 안에 들어오는 것은 87.3% 뿐입니다. 1단계 실패는 제외하지 않고 0점으로 계산합니다(배포 거동). 마지막 열은 간판을 하나도 못 찾은 사진 15장을 뺀 값입니다. 주의 1: AI Hub 열과 GSV 열은 서로 비교하면 안 됩니다. GSV crop 은 긴 변 1,400 px 로 확대해 단어가 이미지 면적의 중앙값 3.8% 를 차지하는 반면 AI Hub 사진에서는 1.8%(2.2배)이고, GSV 는 간판 하나만 든 crop 이라 배경이 거의 없습니다. 주의 2: GSV word GT 는 검출기 4개의 제안을 합집합으로 깔고 사람이 전수 수정해 만들었는데 최종 박스의 97.3% 가 제안과 일치합니다. 네 검출기가 모두 놓친 단어는 GT 에도 거의 없어 GSV 절대값은 낙관적이며, 모델 간 비교로만 읽어야 합니다. 정정: 이전 판의 chained 값(0.815 등)은 간판 검출에 fold0 가중치 하나를 전 사진에 써서, 검출기가 학습 때 본 사진 80% 가 섞여 있었습니다. 이 표의 값이 그것을 대체합니다.</w:t>
       </w:r>
     </w:p>
     <w:tbl>
@@ -987,15 +950,6 @@
           <w:sz w:val="22"/>
         </w:rPr>
         <w:t>Table 3. Each OCR recognizer on its own, by region (line exact / CER)</w:t>
-      </w:r>
-    </w:p>
-    <w:p>
-      <w:r>
-        <w:rPr>
-          <w:i/>
-          <w:sz w:val="17"/>
-        </w:rPr>
-        <w:t>PROTOCOL — 모든 행에서 고정한 것: word detector(YOLO26x @ conf 0.01), line merging(y_tol 0.04), strip padding(0.04), preprocessing, scoring 규칙(line matching, --mask-phone, Brooklyn 은 English-only 채점). 바꾼 것은 recognizer 하나뿐이고, 모든 행이 single model 입니다(ensemble 없음). 측정은 GSV GT signboard crop 411개 / 592 line. 각 지역 칸은 “line exact % / CER”입니다. 학습 데이터 — Training 열에 적은 대로 두 가지가 섞여 있습니다. PaddleOCR·PARSeq·SVTRv2-B 는 AI Hub signboard_v3 의 word crop 62,464 + real line crop 13,148 = 75,612 로 학습했고, EasyOCR·TrOCR-base·Tesseract 는 같은 split 의 word crop 만으로 학습했습니다. 평가 입력은 여러 단어가 든 line strip 이라, 이 세 행은 line 입력을 학습에서 보지 못한 조건입니다. WAR(word accuracy)가 이를 보여줍니다 — 이 세 행 0.20~0.29, line 을 학습한 세 행 0.67~0.69. 특히 EasyOCR·TrOCR 는 출력 line 에 공백이 한 번도 없고(0%, line 학습 행은 69~79%), line recall(CER&lt;1 인 line 비율)은 92~93% 로 line 학습 행(93~94%)과 비슷합니다 — 글자는 읽지만 줄 안에서 단어를 나누지 못합니다. Tesseract 는 공백은 내지만 line recall 이 67% 로 읽기 자체가 약합니다. 따라서 이 세 행과의 격차에는 구조 차이와 학습 데이터 차이가 섞여 있습니다. zero-shot 두 행(Surya, CLOVA)은 fine-tuning 이 불가능해서 zero-shot 인 것이며(Surya 는 학습 코드 미공개, CLOVA 는 상용 API), “학습 없이 그대로 쓰면 얼마인가”에 답하므로 fine-tuned 행과 한 순위표로 읽으면 안 됩니다. TrOCR-base 는 gradient clipping 1.0 · lr 2e-5 · warmup 500 · linear decay 로 학습했습니다(자체 test split exact 91.0%). ABINet 과 MAERec 은 공용 harness(OpenOCR)의 학습 코드 오류 2건으로 측정하지 못했습니다(“—”).</w:t>
       </w:r>
     </w:p>
     <w:tbl>
@@ -2176,7 +2130,7 @@
           <w:p>
             <w:r>
               <w:rPr>
-                <w:b/>
+                <w:b w:val="0"/>
                 <w:sz w:val="17"/>
               </w:rPr>
               <w:t>PaddleOCR PP-OCRv5 rec</w:t>
@@ -2193,7 +2147,7 @@
             </w:pPr>
             <w:r>
               <w:rPr>
-                <w:b/>
+                <w:b w:val="0"/>
                 <w:sz w:val="17"/>
               </w:rPr>
               <w:t>Baidu PaddleOCR's 5th-generation recognizer — the previously deployed model</w:t>
@@ -2210,10 +2164,162 @@
             </w:pPr>
             <w:r>
               <w:rPr>
+                <w:b w:val="0"/>
+                <w:sz w:val="17"/>
+              </w:rPr>
+              <w:t>The previously deployed recognizer; the reference row for the replacement decision</w:t>
+            </w:r>
+          </w:p>
+        </w:tc>
+        <w:tc>
+          <w:tcPr>
+            <w:tcW w:type="dxa" w:w="960"/>
+          </w:tcPr>
+          <w:p>
+            <w:pPr>
+              <w:jc w:val="right"/>
+            </w:pPr>
+            <w:r>
+              <w:rPr>
+                <w:b w:val="0"/>
+                <w:sz w:val="17"/>
+              </w:rPr>
+              <w:t>fine-tuned (words + lines)</w:t>
+            </w:r>
+          </w:p>
+        </w:tc>
+        <w:tc>
+          <w:tcPr>
+            <w:tcW w:type="dxa" w:w="960"/>
+          </w:tcPr>
+          <w:p>
+            <w:pPr>
+              <w:jc w:val="right"/>
+            </w:pPr>
+            <w:r>
+              <w:rPr>
+                <w:b w:val="0"/>
+                <w:sz w:val="17"/>
+              </w:rPr>
+              <w:t>73.6 / 0.190</w:t>
+            </w:r>
+          </w:p>
+        </w:tc>
+        <w:tc>
+          <w:tcPr>
+            <w:tcW w:type="dxa" w:w="960"/>
+          </w:tcPr>
+          <w:p>
+            <w:pPr>
+              <w:jc w:val="right"/>
+            </w:pPr>
+            <w:r>
+              <w:rPr>
+                <w:b w:val="0"/>
+                <w:sz w:val="17"/>
+              </w:rPr>
+              <w:t>77.9 / 0.108</w:t>
+            </w:r>
+          </w:p>
+        </w:tc>
+        <w:tc>
+          <w:tcPr>
+            <w:tcW w:type="dxa" w:w="960"/>
+          </w:tcPr>
+          <w:p>
+            <w:pPr>
+              <w:jc w:val="right"/>
+            </w:pPr>
+            <w:r>
+              <w:rPr>
+                <w:b w:val="0"/>
+                <w:sz w:val="17"/>
+              </w:rPr>
+              <w:t>68.5 / 0.190</w:t>
+            </w:r>
+          </w:p>
+        </w:tc>
+        <w:tc>
+          <w:tcPr>
+            <w:tcW w:type="dxa" w:w="960"/>
+          </w:tcPr>
+          <w:p>
+            <w:pPr>
+              <w:jc w:val="right"/>
+            </w:pPr>
+            <w:r>
+              <w:rPr>
+                <w:b w:val="0"/>
+                <w:sz w:val="17"/>
+              </w:rPr>
+              <w:t>73.5%</w:t>
+            </w:r>
+          </w:p>
+        </w:tc>
+        <w:tc>
+          <w:tcPr>
+            <w:tcW w:type="dxa" w:w="960"/>
+          </w:tcPr>
+          <w:p>
+            <w:pPr>
+              <w:jc w:val="right"/>
+            </w:pPr>
+            <w:r>
+              <w:rPr>
+                <w:b w:val="0"/>
+                <w:sz w:val="17"/>
+              </w:rPr>
+              <w:t>0.149</w:t>
+            </w:r>
+          </w:p>
+        </w:tc>
+      </w:tr>
+      <w:tr>
+        <w:tc>
+          <w:tcPr>
+            <w:tcW w:type="dxa" w:w="960"/>
+          </w:tcPr>
+          <w:p>
+            <w:r>
+              <w:rPr>
                 <w:b/>
                 <w:sz w:val="17"/>
               </w:rPr>
-              <w:t>The previously deployed recognizer; the reference row for the replacement decision</w:t>
+              <w:t>SVTRv2-B (deployed)</w:t>
+            </w:r>
+          </w:p>
+        </w:tc>
+        <w:tc>
+          <w:tcPr>
+            <w:tcW w:type="dxa" w:w="960"/>
+          </w:tcPr>
+          <w:p>
+            <w:pPr>
+              <w:jc w:val="right"/>
+            </w:pPr>
+            <w:r>
+              <w:rPr>
+                <w:b/>
+                <w:sz w:val="17"/>
+              </w:rPr>
+              <w:t>Single-visual-model STR with a CTC head, OpenOCR (2024); current strong open STR recognizer</w:t>
+            </w:r>
+          </w:p>
+        </w:tc>
+        <w:tc>
+          <w:tcPr>
+            <w:tcW w:type="dxa" w:w="960"/>
+          </w:tcPr>
+          <w:p>
+            <w:pPr>
+              <w:jc w:val="right"/>
+            </w:pPr>
+            <w:r>
+              <w:rPr>
+                <w:b/>
+                <w:sz w:val="17"/>
+              </w:rPr>
+              <w:t>The deployed recognizer. Chosen for cost, not accuracy: it reaches the same corrected output in one recognition pass where the previous configuration needed three</w:t>
             </w:r>
           </w:p>
         </w:tc>
@@ -2247,7 +2353,7 @@
                 <w:b/>
                 <w:sz w:val="17"/>
               </w:rPr>
-              <w:t>73.6 / 0.190</w:t>
+              <w:t>74.5 / 0.185</w:t>
             </w:r>
           </w:p>
         </w:tc>
@@ -2264,7 +2370,7 @@
                 <w:b/>
                 <w:sz w:val="17"/>
               </w:rPr>
-              <w:t>77.9 / 0.108</w:t>
+              <w:t>78.9 / 0.105</w:t>
             </w:r>
           </w:p>
         </w:tc>
@@ -2281,7 +2387,7 @@
                 <w:b/>
                 <w:sz w:val="17"/>
               </w:rPr>
-              <w:t>68.5 / 0.190</w:t>
+              <w:t>72.9 / 0.197</w:t>
             </w:r>
           </w:p>
         </w:tc>
@@ -2298,7 +2404,7 @@
                 <w:b/>
                 <w:sz w:val="17"/>
               </w:rPr>
-              <w:t>73.5%</w:t>
+              <w:t>75.5%</w:t>
             </w:r>
           </w:p>
         </w:tc>
@@ -2313,149 +2419,6 @@
             <w:r>
               <w:rPr>
                 <w:b/>
-                <w:sz w:val="17"/>
-              </w:rPr>
-              <w:t>0.149</w:t>
-            </w:r>
-          </w:p>
-        </w:tc>
-      </w:tr>
-      <w:tr>
-        <w:tc>
-          <w:tcPr>
-            <w:tcW w:type="dxa" w:w="960"/>
-          </w:tcPr>
-          <w:p>
-            <w:r>
-              <w:rPr>
-                <w:sz w:val="17"/>
-              </w:rPr>
-              <w:t>SVTRv2-B (deployed)</w:t>
-            </w:r>
-          </w:p>
-        </w:tc>
-        <w:tc>
-          <w:tcPr>
-            <w:tcW w:type="dxa" w:w="960"/>
-          </w:tcPr>
-          <w:p>
-            <w:pPr>
-              <w:jc w:val="right"/>
-            </w:pPr>
-            <w:r>
-              <w:rPr>
-                <w:sz w:val="17"/>
-              </w:rPr>
-              <w:t>Single-visual-model STR with a CTC head, OpenOCR (2024); current strong open STR recognizer</w:t>
-            </w:r>
-          </w:p>
-        </w:tc>
-        <w:tc>
-          <w:tcPr>
-            <w:tcW w:type="dxa" w:w="960"/>
-          </w:tcPr>
-          <w:p>
-            <w:pPr>
-              <w:jc w:val="right"/>
-            </w:pPr>
-            <w:r>
-              <w:rPr>
-                <w:sz w:val="17"/>
-              </w:rPr>
-              <w:t>The deployed recognizer. Chosen for cost, not accuracy: it reaches the same corrected output in one recognition pass where the previous configuration needed three</w:t>
-            </w:r>
-          </w:p>
-        </w:tc>
-        <w:tc>
-          <w:tcPr>
-            <w:tcW w:type="dxa" w:w="960"/>
-          </w:tcPr>
-          <w:p>
-            <w:pPr>
-              <w:jc w:val="right"/>
-            </w:pPr>
-            <w:r>
-              <w:rPr>
-                <w:sz w:val="17"/>
-              </w:rPr>
-              <w:t>fine-tuned (words + lines)</w:t>
-            </w:r>
-          </w:p>
-        </w:tc>
-        <w:tc>
-          <w:tcPr>
-            <w:tcW w:type="dxa" w:w="960"/>
-          </w:tcPr>
-          <w:p>
-            <w:pPr>
-              <w:jc w:val="right"/>
-            </w:pPr>
-            <w:r>
-              <w:rPr>
-                <w:sz w:val="17"/>
-              </w:rPr>
-              <w:t>74.5 / 0.185</w:t>
-            </w:r>
-          </w:p>
-        </w:tc>
-        <w:tc>
-          <w:tcPr>
-            <w:tcW w:type="dxa" w:w="960"/>
-          </w:tcPr>
-          <w:p>
-            <w:pPr>
-              <w:jc w:val="right"/>
-            </w:pPr>
-            <w:r>
-              <w:rPr>
-                <w:sz w:val="17"/>
-              </w:rPr>
-              <w:t>78.9 / 0.105</w:t>
-            </w:r>
-          </w:p>
-        </w:tc>
-        <w:tc>
-          <w:tcPr>
-            <w:tcW w:type="dxa" w:w="960"/>
-          </w:tcPr>
-          <w:p>
-            <w:pPr>
-              <w:jc w:val="right"/>
-            </w:pPr>
-            <w:r>
-              <w:rPr>
-                <w:sz w:val="17"/>
-              </w:rPr>
-              <w:t>72.9 / 0.197</w:t>
-            </w:r>
-          </w:p>
-        </w:tc>
-        <w:tc>
-          <w:tcPr>
-            <w:tcW w:type="dxa" w:w="960"/>
-          </w:tcPr>
-          <w:p>
-            <w:pPr>
-              <w:jc w:val="right"/>
-            </w:pPr>
-            <w:r>
-              <w:rPr>
-                <w:sz w:val="17"/>
-              </w:rPr>
-              <w:t>75.5%</w:t>
-            </w:r>
-          </w:p>
-        </w:tc>
-        <w:tc>
-          <w:tcPr>
-            <w:tcW w:type="dxa" w:w="960"/>
-          </w:tcPr>
-          <w:p>
-            <w:pPr>
-              <w:jc w:val="right"/>
-            </w:pPr>
-            <w:r>
-              <w:rPr>
                 <w:sz w:val="17"/>
               </w:rPr>
               <w:t>0.147</w:t>
@@ -2750,15 +2713,6 @@
         </w:tc>
       </w:tr>
     </w:tbl>
-    <w:p>
-      <w:r>
-        <w:rPr>
-          <w:i/>
-          <w:sz w:val="17"/>
-        </w:rPr>
-        <w:t>이미 측정한 행들에 대한 held-out 검정입니다. OCR GT 가 있는 사진 277장을 사진 단위로 반으로 나누고(val 137 / test 140, 같은 간판이 양쪽에 걸리지 않게), test 절반(296 line)에서만 차이를 계산했습니다. crop 단위 paired percentile bootstrap, 2,000회 resampling 의 95% confidence interval 입니다. SVTRv2-B vs PaddleOCR +3.5 pp [-0.7, +7.9], PARSeq vs PaddleOCR -3.5 pp [-8.4, +1.0] — 둘 다 0 을 포함하므로 이 세 모델은 순위가 아니라 한 tier 입니다. 반면 CLOVA -13.8 pp [-19.6, -8.2], Surya -28.7 pp [-34.4, -23.1], Tesseract -39~-41 pp 는 구간이 0 을 지나지 않아 확실히 갈립니다. Tesseract 는 우리 word crop 으로 fine-tuning 해도 2.2 pp 밖에 움직이지 않았습니다. 주의할 점: 같은 비교를 더 약한 detector 위에서 돌리면 SVTRv2-B 가 PaddleOCR 를 유의하게 이기고 CLOVA 는 PaddleOCR 와 구분되지 않았습니다. 즉 recognizer 순위는 detector 에 따라 바뀌므로, 논문에 어느 detector 위에서 쟀는지를 반드시 명시해야 합니다.</w:t>
-      </w:r>
-    </w:p>
     <w:p/>
     <w:p>
       <w:r>
@@ -2767,15 +2721,6 @@
           <w:sz w:val="22"/>
         </w:rPr>
         <w:t>Table 4. SVTRv2-B + VLM correction by model and method, by region (line exact / CER)</w:t>
-      </w:r>
-    </w:p>
-    <w:p>
-      <w:r>
-        <w:rPr>
-          <w:i/>
-          <w:sz w:val="17"/>
-        </w:rPr>
-        <w:t>Recognizer 를 배포 구성(SVTRv2-B, YOLO26x strip)으로 고정하고 VLM 두 종(Gemma 4 31B, Qwen3-VL 32B-instruct)을 비교했습니다. 둘 다 Ollama 4-bit, RTX 3080 10GB 한 장에서 GPU/RAM 분할 실행. 세 method 는 모델에게 무엇을 보여주느냐만 다릅니다. fixtext 는 OCR 텍스트만(이미지 없음) — 교정 이득 중 language prior 의 몫을 분리하는 조건. fix 는 간판 이미지 + OCR 텍스트. fixcand 는 이미지 + 같은 strip 을 다른 recognizer 3종(PaddleOCR)이 읽은 후보. 첫 행은 교정 전 값입니다. 측정은 GT signboard crop 411개 / 592 line. 읽히는 것: 이득의 대부분은 이미지에서 옵니다 — 75.5% → 76.5%(fixtext, +1.0 pp) → 83.4%(fix, +6.9 pp). 후보 3종을 더 줘도 +0.2 pp(fixcand)에 그칩니다. 그래서 배포는 fix 입니다 — fixcand 는 recognition pass 를 4회(SVTRv2 + PaddleOCR 3종)로 늘리는데 얻는 게 없고, 이는 PaddleOCR 3-way 투표를 SVTRv2 단일 pass 로 바꾼 근거와 같은 이야기입니다. 이 표에는 confidence interval 을 계산하지 않아 1 pp 안팎의 차이는 실제 차이로 취급하지 않습니다.</w:t>
       </w:r>
     </w:p>
     <w:tbl>
@@ -3689,6 +3634,7 @@
         </w:tc>
       </w:tr>
     </w:tbl>
+    <w:p/>
     <w:sectPr>
       <w:pgSz w:w="12240" w:h="15840"/>
       <w:pgMar w:top="1440" w:right="1800" w:bottom="1440" w:left="1800" w:header="720" w:footer="720" w:gutter="0"/>
@@ -3704,37 +3650,30 @@
         <w:t>Table 5. End-to-end pipeline, configurations A and B: GSV photo → signboard detection → word detection → SVTRv2-B → Gemma 4 31B fix → Gemma 4 31B tagging (298 photos; line exact % / tagging accuracy %)</w:t>
       </w:r>
     </w:p>
-    <w:p>
-      <w:r>
-        <w:rPr>
-          <w:b w:val="0"/>
-          <w:i/>
-          <w:sz w:val="17"/>
-        </w:rPr>
-        <w:t>사진 한 장에서 시작해 간판 검출 → 단어 검출 → SVTRv2 → Gemma 4 fix → 태깅까지 한 번에 돌린 값입니다. 표 1·2 와 같은 GSV 사진 298장(정답 간판 453개)에서 잽니다. 간판 검출은 표 1 의 검출기의 out-of-fold 예측(conf 0.25)으로, 453개 중 374개를 찾고(TP) 79개를 놓쳤으며(FN) 간판이 아닌 것 96개를 간판으로 잘랐습니다(FP). “recall” 은 놓친 간판을 0점으로 분모에 넣은 값(배포 성능), “TP 위” 는 제대로 찾은 간판만 본 값, “GT crop” 은 같은 298장에서 사람이 그린 간판에 같은 모델을 돌린 값입니다. 채점기는 표 3·4 와 같습니다. 구성 A 와 B 는 단어 검출기만 다르고(YOLO26x / YOLOv5x), 간판 검출·인식기·VLM 은 같습니다. 두 구성은 같은 간판 검출 결과를 공유하므로 1단계 행은 하나입니다.</w:t>
-      </w:r>
-    </w:p>
     <w:tbl>
       <w:tblPr>
         <w:tblStyle w:val="TableGrid"/>
-        <w:tblW w:type="auto" w:w="0"/>
+        <w:tblW w:type="dxa" w:w="9936"/>
+        <w:tblLayout w:type="fixed"/>
         <w:tblLook w:firstColumn="1" w:firstRow="1" w:lastColumn="0" w:lastRow="0" w:noHBand="0" w:noVBand="1" w:val="04A0"/>
       </w:tblPr>
       <w:tblGrid>
-        <w:gridCol w:w="1234"/>
-        <w:gridCol w:w="1234"/>
-        <w:gridCol w:w="1234"/>
-        <w:gridCol w:w="1234"/>
-        <w:gridCol w:w="1234"/>
-        <w:gridCol w:w="1234"/>
-        <w:gridCol w:w="1234"/>
+        <w:gridCol w:w="1584"/>
+        <w:gridCol w:w="3168"/>
+        <w:gridCol w:w="1296"/>
+        <w:gridCol w:w="1296"/>
+        <w:gridCol w:w="1296"/>
+        <w:gridCol w:w="1296"/>
       </w:tblGrid>
       <w:tr>
         <w:tc>
           <w:tcPr>
-            <w:tcW w:type="dxa" w:w="1234"/>
+            <w:tcW w:type="dxa" w:w="1584"/>
           </w:tcPr>
           <w:p>
+            <w:pPr>
+              <w:jc w:val="left"/>
+            </w:pPr>
             <w:r>
               <w:rPr>
                 <w:b/>
@@ -3746,11 +3685,11 @@
         </w:tc>
         <w:tc>
           <w:tcPr>
-            <w:tcW w:type="dxa" w:w="1234"/>
+            <w:tcW w:type="dxa" w:w="3168"/>
           </w:tcPr>
           <w:p>
             <w:pPr>
-              <w:jc w:val="right"/>
+              <w:jc w:val="left"/>
             </w:pPr>
             <w:r>
               <w:rPr>
@@ -3763,7 +3702,7 @@
         </w:tc>
         <w:tc>
           <w:tcPr>
-            <w:tcW w:type="dxa" w:w="1234"/>
+            <w:tcW w:type="dxa" w:w="1296"/>
           </w:tcPr>
           <w:p>
             <w:pPr>
@@ -3780,7 +3719,7 @@
         </w:tc>
         <w:tc>
           <w:tcPr>
-            <w:tcW w:type="dxa" w:w="1234"/>
+            <w:tcW w:type="dxa" w:w="1296"/>
           </w:tcPr>
           <w:p>
             <w:pPr>
@@ -3797,7 +3736,7 @@
         </w:tc>
         <w:tc>
           <w:tcPr>
-            <w:tcW w:type="dxa" w:w="1234"/>
+            <w:tcW w:type="dxa" w:w="1296"/>
           </w:tcPr>
           <w:p>
             <w:pPr>
@@ -3814,7 +3753,7 @@
         </w:tc>
         <w:tc>
           <w:tcPr>
-            <w:tcW w:type="dxa" w:w="1234"/>
+            <w:tcW w:type="dxa" w:w="1296"/>
           </w:tcPr>
           <w:p>
             <w:pPr>
@@ -3829,30 +3768,16 @@
             </w:r>
           </w:p>
         </w:tc>
-        <w:tc>
-          <w:tcPr>
-            <w:tcW w:type="dxa" w:w="1234"/>
-          </w:tcPr>
-          <w:p>
-            <w:pPr>
-              <w:jc w:val="right"/>
-            </w:pPr>
-            <w:r>
-              <w:rPr>
-                <w:b/>
-                <w:sz w:val="17"/>
-              </w:rPr>
-              <w:t>Counted over (overall)</w:t>
-            </w:r>
-          </w:p>
-        </w:tc>
       </w:tr>
       <w:tr>
         <w:tc>
           <w:tcPr>
-            <w:tcW w:type="dxa" w:w="1234"/>
+            <w:tcW w:type="dxa" w:w="1584"/>
           </w:tcPr>
           <w:p>
+            <w:pPr>
+              <w:jc w:val="left"/>
+            </w:pPr>
             <w:r>
               <w:rPr>
                 <w:sz w:val="17"/>
@@ -3863,11 +3788,11 @@
         </w:tc>
         <w:tc>
           <w:tcPr>
-            <w:tcW w:type="dxa" w:w="1234"/>
+            <w:tcW w:type="dxa" w:w="3168"/>
           </w:tcPr>
           <w:p>
             <w:pPr>
-              <w:jc w:val="right"/>
+              <w:jc w:val="left"/>
             </w:pPr>
             <w:r>
               <w:rPr>
@@ -3879,7 +3804,7 @@
         </w:tc>
         <w:tc>
           <w:tcPr>
-            <w:tcW w:type="dxa" w:w="1234"/>
+            <w:tcW w:type="dxa" w:w="1296"/>
           </w:tcPr>
           <w:p>
             <w:pPr>
@@ -3895,7 +3820,7 @@
         </w:tc>
         <w:tc>
           <w:tcPr>
-            <w:tcW w:type="dxa" w:w="1234"/>
+            <w:tcW w:type="dxa" w:w="1296"/>
           </w:tcPr>
           <w:p>
             <w:pPr>
@@ -3911,7 +3836,7 @@
         </w:tc>
         <w:tc>
           <w:tcPr>
-            <w:tcW w:type="dxa" w:w="1234"/>
+            <w:tcW w:type="dxa" w:w="1296"/>
           </w:tcPr>
           <w:p>
             <w:pPr>
@@ -3927,7 +3852,7 @@
         </w:tc>
         <w:tc>
           <w:tcPr>
-            <w:tcW w:type="dxa" w:w="1234"/>
+            <w:tcW w:type="dxa" w:w="1296"/>
           </w:tcPr>
           <w:p>
             <w:pPr>
@@ -3941,30 +3866,17 @@
             </w:r>
           </w:p>
         </w:tc>
-        <w:tc>
-          <w:tcPr>
-            <w:tcW w:type="dxa" w:w="1234"/>
-          </w:tcPr>
-          <w:p>
-            <w:pPr>
-              <w:jc w:val="right"/>
-            </w:pPr>
-            <w:r>
-              <w:rPr>
-                <w:sz w:val="17"/>
-              </w:rPr>
-              <w:t>453 GT signboards, 298 photos</w:t>
-            </w:r>
-          </w:p>
-        </w:tc>
       </w:tr>
       <w:tr>
         <w:tc>
           <w:tcPr>
-            <w:tcW w:type="dxa" w:w="1234"/>
+            <w:tcW w:type="dxa" w:w="1584"/>
             <w:vMerge w:val="restart"/>
           </w:tcPr>
           <w:p>
+            <w:pPr>
+              <w:jc w:val="left"/>
+            </w:pPr>
             <w:r>
               <w:rPr>
                 <w:sz w:val="17"/>
@@ -3975,116 +3887,11 @@
         </w:tc>
         <w:tc>
           <w:tcPr>
-            <w:tcW w:type="dxa" w:w="1234"/>
+            <w:tcW w:type="dxa" w:w="3168"/>
           </w:tcPr>
           <w:p>
             <w:pPr>
-              <w:jc w:val="right"/>
-            </w:pPr>
-            <w:r>
-              <w:rPr>
-                <w:sz w:val="17"/>
-              </w:rPr>
-              <w:t>OCR line exact — pipeline (missed signboards scored as wrong)</w:t>
-            </w:r>
-          </w:p>
-        </w:tc>
-        <w:tc>
-          <w:tcPr>
-            <w:tcW w:type="dxa" w:w="1234"/>
-          </w:tcPr>
-          <w:p>
-            <w:pPr>
-              <w:jc w:val="right"/>
-            </w:pPr>
-            <w:r>
-              <w:rPr>
-                <w:sz w:val="17"/>
-              </w:rPr>
-              <w:t>63.6</w:t>
-            </w:r>
-          </w:p>
-        </w:tc>
-        <w:tc>
-          <w:tcPr>
-            <w:tcW w:type="dxa" w:w="1234"/>
-          </w:tcPr>
-          <w:p>
-            <w:pPr>
-              <w:jc w:val="right"/>
-            </w:pPr>
-            <w:r>
-              <w:rPr>
-                <w:sz w:val="17"/>
-              </w:rPr>
-              <w:t>67.0</w:t>
-            </w:r>
-          </w:p>
-        </w:tc>
-        <w:tc>
-          <w:tcPr>
-            <w:tcW w:type="dxa" w:w="1234"/>
-          </w:tcPr>
-          <w:p>
-            <w:pPr>
-              <w:jc w:val="right"/>
-            </w:pPr>
-            <w:r>
-              <w:rPr>
-                <w:sz w:val="17"/>
-              </w:rPr>
-              <w:t>63.0</w:t>
-            </w:r>
-          </w:p>
-        </w:tc>
-        <w:tc>
-          <w:tcPr>
-            <w:tcW w:type="dxa" w:w="1234"/>
-          </w:tcPr>
-          <w:p>
-            <w:pPr>
-              <w:jc w:val="right"/>
-            </w:pPr>
-            <w:r>
-              <w:rPr>
-                <w:sz w:val="17"/>
-              </w:rPr>
-              <w:t>64.5%</w:t>
-            </w:r>
-          </w:p>
-        </w:tc>
-        <w:tc>
-          <w:tcPr>
-            <w:tcW w:type="dxa" w:w="1234"/>
-          </w:tcPr>
-          <w:p>
-            <w:pPr>
-              <w:jc w:val="right"/>
-            </w:pPr>
-            <w:r>
-              <w:rPr>
-                <w:sz w:val="17"/>
-              </w:rPr>
-              <w:t>581 GT lines</w:t>
-            </w:r>
-          </w:p>
-        </w:tc>
-      </w:tr>
-      <w:tr>
-        <w:tc>
-          <w:tcPr>
-            <w:tcW w:type="dxa" w:w="1234"/>
-            <w:vMerge/>
-          </w:tcPr>
-          <w:p/>
-        </w:tc>
-        <w:tc>
-          <w:tcPr>
-            <w:tcW w:type="dxa" w:w="1234"/>
-          </w:tcPr>
-          <w:p>
-            <w:pPr>
-              <w:jc w:val="right"/>
+              <w:jc w:val="left"/>
             </w:pPr>
             <w:r>
               <w:rPr>
@@ -4096,7 +3903,7 @@
         </w:tc>
         <w:tc>
           <w:tcPr>
-            <w:tcW w:type="dxa" w:w="1234"/>
+            <w:tcW w:type="dxa" w:w="1296"/>
           </w:tcPr>
           <w:p>
             <w:pPr>
@@ -4112,7 +3919,7 @@
         </w:tc>
         <w:tc>
           <w:tcPr>
-            <w:tcW w:type="dxa" w:w="1234"/>
+            <w:tcW w:type="dxa" w:w="1296"/>
           </w:tcPr>
           <w:p>
             <w:pPr>
@@ -4128,7 +3935,7 @@
         </w:tc>
         <w:tc>
           <w:tcPr>
-            <w:tcW w:type="dxa" w:w="1234"/>
+            <w:tcW w:type="dxa" w:w="1296"/>
           </w:tcPr>
           <w:p>
             <w:pPr>
@@ -4144,7 +3951,7 @@
         </w:tc>
         <w:tc>
           <w:tcPr>
-            <w:tcW w:type="dxa" w:w="1234"/>
+            <w:tcW w:type="dxa" w:w="1296"/>
           </w:tcPr>
           <w:p>
             <w:pPr>
@@ -4155,22 +3962,6 @@
                 <w:sz w:val="17"/>
               </w:rPr>
               <w:t>77.2%</w:t>
-            </w:r>
-          </w:p>
-        </w:tc>
-        <w:tc>
-          <w:tcPr>
-            <w:tcW w:type="dxa" w:w="1234"/>
-          </w:tcPr>
-          <w:p>
-            <w:pPr>
-              <w:jc w:val="right"/>
-            </w:pPr>
-            <w:r>
-              <w:rPr>
-                <w:sz w:val="17"/>
-              </w:rPr>
-              <w:t>lines of the 374 TP signboards</w:t>
             </w:r>
           </w:p>
         </w:tc>
@@ -4185,11 +3976,11 @@
         </w:tc>
         <w:tc>
           <w:tcPr>
-            <w:tcW w:type="dxa" w:w="1234"/>
+            <w:tcW w:type="dxa" w:w="3168"/>
           </w:tcPr>
           <w:p>
             <w:pPr>
-              <w:jc w:val="right"/>
+              <w:jc w:val="left"/>
             </w:pPr>
             <w:r>
               <w:rPr>
@@ -4201,7 +3992,7 @@
         </w:tc>
         <w:tc>
           <w:tcPr>
-            <w:tcW w:type="dxa" w:w="1234"/>
+            <w:tcW w:type="dxa" w:w="1296"/>
           </w:tcPr>
           <w:p>
             <w:pPr>
@@ -4217,7 +4008,7 @@
         </w:tc>
         <w:tc>
           <w:tcPr>
-            <w:tcW w:type="dxa" w:w="1234"/>
+            <w:tcW w:type="dxa" w:w="1296"/>
           </w:tcPr>
           <w:p>
             <w:pPr>
@@ -4233,7 +4024,7 @@
         </w:tc>
         <w:tc>
           <w:tcPr>
-            <w:tcW w:type="dxa" w:w="1234"/>
+            <w:tcW w:type="dxa" w:w="1296"/>
           </w:tcPr>
           <w:p>
             <w:pPr>
@@ -4249,7 +4040,7 @@
         </w:tc>
         <w:tc>
           <w:tcPr>
-            <w:tcW w:type="dxa" w:w="1234"/>
+            <w:tcW w:type="dxa" w:w="1296"/>
           </w:tcPr>
           <w:p>
             <w:pPr>
@@ -4260,22 +4051,6 @@
                 <w:sz w:val="17"/>
               </w:rPr>
               <w:t>83.6%</w:t>
-            </w:r>
-          </w:p>
-        </w:tc>
-        <w:tc>
-          <w:tcPr>
-            <w:tcW w:type="dxa" w:w="1234"/>
-          </w:tcPr>
-          <w:p>
-            <w:pPr>
-              <w:jc w:val="right"/>
-            </w:pPr>
-            <w:r>
-              <w:rPr>
-                <w:sz w:val="17"/>
-              </w:rPr>
-              <w:t>581 GT lines</w:t>
             </w:r>
           </w:p>
         </w:tc>
@@ -4290,116 +4065,11 @@
         </w:tc>
         <w:tc>
           <w:tcPr>
-            <w:tcW w:type="dxa" w:w="1234"/>
+            <w:tcW w:type="dxa" w:w="3168"/>
           </w:tcPr>
           <w:p>
             <w:pPr>
-              <w:jc w:val="right"/>
-            </w:pPr>
-            <w:r>
-              <w:rPr>
-                <w:sz w:val="17"/>
-              </w:rPr>
-              <w:t>Tagging accuracy — pipeline (missed signboards scored as wrong)</w:t>
-            </w:r>
-          </w:p>
-        </w:tc>
-        <w:tc>
-          <w:tcPr>
-            <w:tcW w:type="dxa" w:w="1234"/>
-          </w:tcPr>
-          <w:p>
-            <w:pPr>
-              <w:jc w:val="right"/>
-            </w:pPr>
-            <w:r>
-              <w:rPr>
-                <w:sz w:val="17"/>
-              </w:rPr>
-              <w:t>72.0</w:t>
-            </w:r>
-          </w:p>
-        </w:tc>
-        <w:tc>
-          <w:tcPr>
-            <w:tcW w:type="dxa" w:w="1234"/>
-          </w:tcPr>
-          <w:p>
-            <w:pPr>
-              <w:jc w:val="right"/>
-            </w:pPr>
-            <w:r>
-              <w:rPr>
-                <w:sz w:val="17"/>
-              </w:rPr>
-              <w:t>61.7</w:t>
-            </w:r>
-          </w:p>
-        </w:tc>
-        <w:tc>
-          <w:tcPr>
-            <w:tcW w:type="dxa" w:w="1234"/>
-          </w:tcPr>
-          <w:p>
-            <w:pPr>
-              <w:jc w:val="right"/>
-            </w:pPr>
-            <w:r>
-              <w:rPr>
-                <w:sz w:val="17"/>
-              </w:rPr>
-              <w:t>69.3</w:t>
-            </w:r>
-          </w:p>
-        </w:tc>
-        <w:tc>
-          <w:tcPr>
-            <w:tcW w:type="dxa" w:w="1234"/>
-          </w:tcPr>
-          <w:p>
-            <w:pPr>
-              <w:jc w:val="right"/>
-            </w:pPr>
-            <w:r>
-              <w:rPr>
-                <w:sz w:val="17"/>
-              </w:rPr>
-              <w:t>67.7%</w:t>
-            </w:r>
-          </w:p>
-        </w:tc>
-        <w:tc>
-          <w:tcPr>
-            <w:tcW w:type="dxa" w:w="1234"/>
-          </w:tcPr>
-          <w:p>
-            <w:pPr>
-              <w:jc w:val="right"/>
-            </w:pPr>
-            <w:r>
-              <w:rPr>
-                <w:sz w:val="17"/>
-              </w:rPr>
-              <w:t>387 tagging targets</w:t>
-            </w:r>
-          </w:p>
-        </w:tc>
-      </w:tr>
-      <w:tr>
-        <w:tc>
-          <w:tcPr>
-            <w:tcW w:type="dxa" w:w="1234"/>
-            <w:vMerge/>
-          </w:tcPr>
-          <w:p/>
-        </w:tc>
-        <w:tc>
-          <w:tcPr>
-            <w:tcW w:type="dxa" w:w="1234"/>
-          </w:tcPr>
-          <w:p>
-            <w:pPr>
-              <w:jc w:val="right"/>
+              <w:jc w:val="left"/>
             </w:pPr>
             <w:r>
               <w:rPr>
@@ -4411,7 +4081,7 @@
         </w:tc>
         <w:tc>
           <w:tcPr>
-            <w:tcW w:type="dxa" w:w="1234"/>
+            <w:tcW w:type="dxa" w:w="1296"/>
           </w:tcPr>
           <w:p>
             <w:pPr>
@@ -4427,7 +4097,7 @@
         </w:tc>
         <w:tc>
           <w:tcPr>
-            <w:tcW w:type="dxa" w:w="1234"/>
+            <w:tcW w:type="dxa" w:w="1296"/>
           </w:tcPr>
           <w:p>
             <w:pPr>
@@ -4443,7 +4113,7 @@
         </w:tc>
         <w:tc>
           <w:tcPr>
-            <w:tcW w:type="dxa" w:w="1234"/>
+            <w:tcW w:type="dxa" w:w="1296"/>
           </w:tcPr>
           <w:p>
             <w:pPr>
@@ -4459,7 +4129,7 @@
         </w:tc>
         <w:tc>
           <w:tcPr>
-            <w:tcW w:type="dxa" w:w="1234"/>
+            <w:tcW w:type="dxa" w:w="1296"/>
           </w:tcPr>
           <w:p>
             <w:pPr>
@@ -4470,22 +4140,6 @@
                 <w:sz w:val="17"/>
               </w:rPr>
               <w:t>80.6%</w:t>
-            </w:r>
-          </w:p>
-        </w:tc>
-        <w:tc>
-          <w:tcPr>
-            <w:tcW w:type="dxa" w:w="1234"/>
-          </w:tcPr>
-          <w:p>
-            <w:pPr>
-              <w:jc w:val="right"/>
-            </w:pPr>
-            <w:r>
-              <w:rPr>
-                <w:sz w:val="17"/>
-              </w:rPr>
-              <w:t>tagging targets among TP</w:t>
             </w:r>
           </w:p>
         </w:tc>
@@ -4500,11 +4154,11 @@
         </w:tc>
         <w:tc>
           <w:tcPr>
-            <w:tcW w:type="dxa" w:w="1234"/>
+            <w:tcW w:type="dxa" w:w="3168"/>
           </w:tcPr>
           <w:p>
             <w:pPr>
-              <w:jc w:val="right"/>
+              <w:jc w:val="left"/>
             </w:pPr>
             <w:r>
               <w:rPr>
@@ -4516,7 +4170,7 @@
         </w:tc>
         <w:tc>
           <w:tcPr>
-            <w:tcW w:type="dxa" w:w="1234"/>
+            <w:tcW w:type="dxa" w:w="1296"/>
           </w:tcPr>
           <w:p>
             <w:pPr>
@@ -4532,7 +4186,7 @@
         </w:tc>
         <w:tc>
           <w:tcPr>
-            <w:tcW w:type="dxa" w:w="1234"/>
+            <w:tcW w:type="dxa" w:w="1296"/>
           </w:tcPr>
           <w:p>
             <w:pPr>
@@ -4548,7 +4202,7 @@
         </w:tc>
         <w:tc>
           <w:tcPr>
-            <w:tcW w:type="dxa" w:w="1234"/>
+            <w:tcW w:type="dxa" w:w="1296"/>
           </w:tcPr>
           <w:p>
             <w:pPr>
@@ -4564,7 +4218,7 @@
         </w:tc>
         <w:tc>
           <w:tcPr>
-            <w:tcW w:type="dxa" w:w="1234"/>
+            <w:tcW w:type="dxa" w:w="1296"/>
           </w:tcPr>
           <w:p>
             <w:pPr>
@@ -4578,30 +4232,17 @@
             </w:r>
           </w:p>
         </w:tc>
-        <w:tc>
-          <w:tcPr>
-            <w:tcW w:type="dxa" w:w="1234"/>
-          </w:tcPr>
-          <w:p>
-            <w:pPr>
-              <w:jc w:val="right"/>
-            </w:pPr>
-            <w:r>
-              <w:rPr>
-                <w:sz w:val="17"/>
-              </w:rPr>
-              <w:t>96 FP crops</w:t>
-            </w:r>
-          </w:p>
-        </w:tc>
       </w:tr>
       <w:tr>
         <w:tc>
           <w:tcPr>
-            <w:tcW w:type="dxa" w:w="1234"/>
+            <w:tcW w:type="dxa" w:w="1584"/>
             <w:vMerge w:val="restart"/>
           </w:tcPr>
           <w:p>
+            <w:pPr>
+              <w:jc w:val="left"/>
+            </w:pPr>
             <w:r>
               <w:rPr>
                 <w:sz w:val="17"/>
@@ -4612,116 +4253,11 @@
         </w:tc>
         <w:tc>
           <w:tcPr>
-            <w:tcW w:type="dxa" w:w="1234"/>
+            <w:tcW w:type="dxa" w:w="3168"/>
           </w:tcPr>
           <w:p>
             <w:pPr>
-              <w:jc w:val="right"/>
-            </w:pPr>
-            <w:r>
-              <w:rPr>
-                <w:sz w:val="17"/>
-              </w:rPr>
-              <w:t>OCR line exact — pipeline (missed signboards scored as wrong)</w:t>
-            </w:r>
-          </w:p>
-        </w:tc>
-        <w:tc>
-          <w:tcPr>
-            <w:tcW w:type="dxa" w:w="1234"/>
-          </w:tcPr>
-          <w:p>
-            <w:pPr>
-              <w:jc w:val="right"/>
-            </w:pPr>
-            <w:r>
-              <w:rPr>
-                <w:sz w:val="17"/>
-              </w:rPr>
-              <w:t>62.6</w:t>
-            </w:r>
-          </w:p>
-        </w:tc>
-        <w:tc>
-          <w:tcPr>
-            <w:tcW w:type="dxa" w:w="1234"/>
-          </w:tcPr>
-          <w:p>
-            <w:pPr>
-              <w:jc w:val="right"/>
-            </w:pPr>
-            <w:r>
-              <w:rPr>
-                <w:sz w:val="17"/>
-              </w:rPr>
-              <w:t>64.9</w:t>
-            </w:r>
-          </w:p>
-        </w:tc>
-        <w:tc>
-          <w:tcPr>
-            <w:tcW w:type="dxa" w:w="1234"/>
-          </w:tcPr>
-          <w:p>
-            <w:pPr>
-              <w:jc w:val="right"/>
-            </w:pPr>
-            <w:r>
-              <w:rPr>
-                <w:sz w:val="17"/>
-              </w:rPr>
-              <w:t>60.8</w:t>
-            </w:r>
-          </w:p>
-        </w:tc>
-        <w:tc>
-          <w:tcPr>
-            <w:tcW w:type="dxa" w:w="1234"/>
-          </w:tcPr>
-          <w:p>
-            <w:pPr>
-              <w:jc w:val="right"/>
-            </w:pPr>
-            <w:r>
-              <w:rPr>
-                <w:sz w:val="17"/>
-              </w:rPr>
-              <w:t>62.8%</w:t>
-            </w:r>
-          </w:p>
-        </w:tc>
-        <w:tc>
-          <w:tcPr>
-            <w:tcW w:type="dxa" w:w="1234"/>
-          </w:tcPr>
-          <w:p>
-            <w:pPr>
-              <w:jc w:val="right"/>
-            </w:pPr>
-            <w:r>
-              <w:rPr>
-                <w:sz w:val="17"/>
-              </w:rPr>
-              <w:t>581 GT lines</w:t>
-            </w:r>
-          </w:p>
-        </w:tc>
-      </w:tr>
-      <w:tr>
-        <w:tc>
-          <w:tcPr>
-            <w:tcW w:type="dxa" w:w="1234"/>
-            <w:vMerge/>
-          </w:tcPr>
-          <w:p/>
-        </w:tc>
-        <w:tc>
-          <w:tcPr>
-            <w:tcW w:type="dxa" w:w="1234"/>
-          </w:tcPr>
-          <w:p>
-            <w:pPr>
-              <w:jc w:val="right"/>
+              <w:jc w:val="left"/>
             </w:pPr>
             <w:r>
               <w:rPr>
@@ -4733,7 +4269,7 @@
         </w:tc>
         <w:tc>
           <w:tcPr>
-            <w:tcW w:type="dxa" w:w="1234"/>
+            <w:tcW w:type="dxa" w:w="1296"/>
           </w:tcPr>
           <w:p>
             <w:pPr>
@@ -4749,7 +4285,7 @@
         </w:tc>
         <w:tc>
           <w:tcPr>
-            <w:tcW w:type="dxa" w:w="1234"/>
+            <w:tcW w:type="dxa" w:w="1296"/>
           </w:tcPr>
           <w:p>
             <w:pPr>
@@ -4765,7 +4301,7 @@
         </w:tc>
         <w:tc>
           <w:tcPr>
-            <w:tcW w:type="dxa" w:w="1234"/>
+            <w:tcW w:type="dxa" w:w="1296"/>
           </w:tcPr>
           <w:p>
             <w:pPr>
@@ -4781,7 +4317,7 @@
         </w:tc>
         <w:tc>
           <w:tcPr>
-            <w:tcW w:type="dxa" w:w="1234"/>
+            <w:tcW w:type="dxa" w:w="1296"/>
           </w:tcPr>
           <w:p>
             <w:pPr>
@@ -4792,22 +4328,6 @@
                 <w:sz w:val="17"/>
               </w:rPr>
               <w:t>75.1%</w:t>
-            </w:r>
-          </w:p>
-        </w:tc>
-        <w:tc>
-          <w:tcPr>
-            <w:tcW w:type="dxa" w:w="1234"/>
-          </w:tcPr>
-          <w:p>
-            <w:pPr>
-              <w:jc w:val="right"/>
-            </w:pPr>
-            <w:r>
-              <w:rPr>
-                <w:sz w:val="17"/>
-              </w:rPr>
-              <w:t>lines of the 374 TP signboards</w:t>
             </w:r>
           </w:p>
         </w:tc>
@@ -4822,11 +4342,11 @@
         </w:tc>
         <w:tc>
           <w:tcPr>
-            <w:tcW w:type="dxa" w:w="1234"/>
+            <w:tcW w:type="dxa" w:w="3168"/>
           </w:tcPr>
           <w:p>
             <w:pPr>
-              <w:jc w:val="right"/>
+              <w:jc w:val="left"/>
             </w:pPr>
             <w:r>
               <w:rPr>
@@ -4838,7 +4358,7 @@
         </w:tc>
         <w:tc>
           <w:tcPr>
-            <w:tcW w:type="dxa" w:w="1234"/>
+            <w:tcW w:type="dxa" w:w="1296"/>
           </w:tcPr>
           <w:p>
             <w:pPr>
@@ -4854,7 +4374,7 @@
         </w:tc>
         <w:tc>
           <w:tcPr>
-            <w:tcW w:type="dxa" w:w="1234"/>
+            <w:tcW w:type="dxa" w:w="1296"/>
           </w:tcPr>
           <w:p>
             <w:pPr>
@@ -4870,7 +4390,7 @@
         </w:tc>
         <w:tc>
           <w:tcPr>
-            <w:tcW w:type="dxa" w:w="1234"/>
+            <w:tcW w:type="dxa" w:w="1296"/>
           </w:tcPr>
           <w:p>
             <w:pPr>
@@ -4886,7 +4406,7 @@
         </w:tc>
         <w:tc>
           <w:tcPr>
-            <w:tcW w:type="dxa" w:w="1234"/>
+            <w:tcW w:type="dxa" w:w="1296"/>
           </w:tcPr>
           <w:p>
             <w:pPr>
@@ -4897,22 +4417,6 @@
                 <w:sz w:val="17"/>
               </w:rPr>
               <w:t>82.4%</w:t>
-            </w:r>
-          </w:p>
-        </w:tc>
-        <w:tc>
-          <w:tcPr>
-            <w:tcW w:type="dxa" w:w="1234"/>
-          </w:tcPr>
-          <w:p>
-            <w:pPr>
-              <w:jc w:val="right"/>
-            </w:pPr>
-            <w:r>
-              <w:rPr>
-                <w:sz w:val="17"/>
-              </w:rPr>
-              <w:t>581 GT lines</w:t>
             </w:r>
           </w:p>
         </w:tc>
@@ -4927,116 +4431,11 @@
         </w:tc>
         <w:tc>
           <w:tcPr>
-            <w:tcW w:type="dxa" w:w="1234"/>
+            <w:tcW w:type="dxa" w:w="3168"/>
           </w:tcPr>
           <w:p>
             <w:pPr>
-              <w:jc w:val="right"/>
-            </w:pPr>
-            <w:r>
-              <w:rPr>
-                <w:sz w:val="17"/>
-              </w:rPr>
-              <w:t>Tagging accuracy — pipeline (missed signboards scored as wrong)</w:t>
-            </w:r>
-          </w:p>
-        </w:tc>
-        <w:tc>
-          <w:tcPr>
-            <w:tcW w:type="dxa" w:w="1234"/>
-          </w:tcPr>
-          <w:p>
-            <w:pPr>
-              <w:jc w:val="right"/>
-            </w:pPr>
-            <w:r>
-              <w:rPr>
-                <w:sz w:val="17"/>
-              </w:rPr>
-              <w:t>71.2</w:t>
-            </w:r>
-          </w:p>
-        </w:tc>
-        <w:tc>
-          <w:tcPr>
-            <w:tcW w:type="dxa" w:w="1234"/>
-          </w:tcPr>
-          <w:p>
-            <w:pPr>
-              <w:jc w:val="right"/>
-            </w:pPr>
-            <w:r>
-              <w:rPr>
-                <w:sz w:val="17"/>
-              </w:rPr>
-              <w:t>60.9</w:t>
-            </w:r>
-          </w:p>
-        </w:tc>
-        <w:tc>
-          <w:tcPr>
-            <w:tcW w:type="dxa" w:w="1234"/>
-          </w:tcPr>
-          <w:p>
-            <w:pPr>
-              <w:jc w:val="right"/>
-            </w:pPr>
-            <w:r>
-              <w:rPr>
-                <w:sz w:val="17"/>
-              </w:rPr>
-              <w:t>70.9</w:t>
-            </w:r>
-          </w:p>
-        </w:tc>
-        <w:tc>
-          <w:tcPr>
-            <w:tcW w:type="dxa" w:w="1234"/>
-          </w:tcPr>
-          <w:p>
-            <w:pPr>
-              <w:jc w:val="right"/>
-            </w:pPr>
-            <w:r>
-              <w:rPr>
-                <w:sz w:val="17"/>
-              </w:rPr>
-              <w:t>67.7%</w:t>
-            </w:r>
-          </w:p>
-        </w:tc>
-        <w:tc>
-          <w:tcPr>
-            <w:tcW w:type="dxa" w:w="1234"/>
-          </w:tcPr>
-          <w:p>
-            <w:pPr>
-              <w:jc w:val="right"/>
-            </w:pPr>
-            <w:r>
-              <w:rPr>
-                <w:sz w:val="17"/>
-              </w:rPr>
-              <w:t>387 tagging targets</w:t>
-            </w:r>
-          </w:p>
-        </w:tc>
-      </w:tr>
-      <w:tr>
-        <w:tc>
-          <w:tcPr>
-            <w:tcW w:type="dxa" w:w="1234"/>
-            <w:vMerge/>
-          </w:tcPr>
-          <w:p/>
-        </w:tc>
-        <w:tc>
-          <w:tcPr>
-            <w:tcW w:type="dxa" w:w="1234"/>
-          </w:tcPr>
-          <w:p>
-            <w:pPr>
-              <w:jc w:val="right"/>
+              <w:jc w:val="left"/>
             </w:pPr>
             <w:r>
               <w:rPr>
@@ -5048,7 +4447,7 @@
         </w:tc>
         <w:tc>
           <w:tcPr>
-            <w:tcW w:type="dxa" w:w="1234"/>
+            <w:tcW w:type="dxa" w:w="1296"/>
           </w:tcPr>
           <w:p>
             <w:pPr>
@@ -5064,7 +4463,7 @@
         </w:tc>
         <w:tc>
           <w:tcPr>
-            <w:tcW w:type="dxa" w:w="1234"/>
+            <w:tcW w:type="dxa" w:w="1296"/>
           </w:tcPr>
           <w:p>
             <w:pPr>
@@ -5080,7 +4479,7 @@
         </w:tc>
         <w:tc>
           <w:tcPr>
-            <w:tcW w:type="dxa" w:w="1234"/>
+            <w:tcW w:type="dxa" w:w="1296"/>
           </w:tcPr>
           <w:p>
             <w:pPr>
@@ -5096,7 +4495,7 @@
         </w:tc>
         <w:tc>
           <w:tcPr>
-            <w:tcW w:type="dxa" w:w="1234"/>
+            <w:tcW w:type="dxa" w:w="1296"/>
           </w:tcPr>
           <w:p>
             <w:pPr>
@@ -5107,22 +4506,6 @@
                 <w:sz w:val="17"/>
               </w:rPr>
               <w:t>80.6%</w:t>
-            </w:r>
-          </w:p>
-        </w:tc>
-        <w:tc>
-          <w:tcPr>
-            <w:tcW w:type="dxa" w:w="1234"/>
-          </w:tcPr>
-          <w:p>
-            <w:pPr>
-              <w:jc w:val="right"/>
-            </w:pPr>
-            <w:r>
-              <w:rPr>
-                <w:sz w:val="17"/>
-              </w:rPr>
-              <w:t>tagging targets among TP</w:t>
             </w:r>
           </w:p>
         </w:tc>
@@ -5137,11 +4520,11 @@
         </w:tc>
         <w:tc>
           <w:tcPr>
-            <w:tcW w:type="dxa" w:w="1234"/>
+            <w:tcW w:type="dxa" w:w="3168"/>
           </w:tcPr>
           <w:p>
             <w:pPr>
-              <w:jc w:val="right"/>
+              <w:jc w:val="left"/>
             </w:pPr>
             <w:r>
               <w:rPr>
@@ -5153,7 +4536,7 @@
         </w:tc>
         <w:tc>
           <w:tcPr>
-            <w:tcW w:type="dxa" w:w="1234"/>
+            <w:tcW w:type="dxa" w:w="1296"/>
           </w:tcPr>
           <w:p>
             <w:pPr>
@@ -5169,7 +4552,7 @@
         </w:tc>
         <w:tc>
           <w:tcPr>
-            <w:tcW w:type="dxa" w:w="1234"/>
+            <w:tcW w:type="dxa" w:w="1296"/>
           </w:tcPr>
           <w:p>
             <w:pPr>
@@ -5185,7 +4568,7 @@
         </w:tc>
         <w:tc>
           <w:tcPr>
-            <w:tcW w:type="dxa" w:w="1234"/>
+            <w:tcW w:type="dxa" w:w="1296"/>
           </w:tcPr>
           <w:p>
             <w:pPr>
@@ -5201,7 +4584,7 @@
         </w:tc>
         <w:tc>
           <w:tcPr>
-            <w:tcW w:type="dxa" w:w="1234"/>
+            <w:tcW w:type="dxa" w:w="1296"/>
           </w:tcPr>
           <w:p>
             <w:pPr>
@@ -5215,54 +4598,8 @@
             </w:r>
           </w:p>
         </w:tc>
-        <w:tc>
-          <w:tcPr>
-            <w:tcW w:type="dxa" w:w="1234"/>
-          </w:tcPr>
-          <w:p>
-            <w:pPr>
-              <w:jc w:val="right"/>
-            </w:pPr>
-            <w:r>
-              <w:rPr>
-                <w:sz w:val="17"/>
-              </w:rPr>
-              <w:t>96 FP crops</w:t>
-            </w:r>
-          </w:p>
-        </w:tc>
       </w:tr>
     </w:tbl>
-    <w:p>
-      <w:r>
-        <w:rPr>
-          <w:b w:val="0"/>
-          <w:i/>
-          <w:sz w:val="17"/>
-        </w:rPr>
-        <w:t>연쇄 OCR (line exact, 581 line): recall 64.5% · TP 위 77.2% · GT crop 83.6%. 83.6 → 77.2 가 간판을 찾았지만 박스가 달라 생긴 손실, 77.2 → 64.5 가 못 찾은 간판 79개의 몫입니다.</w:t>
-      </w:r>
-    </w:p>
-    <w:p>
-      <w:r>
-        <w:rPr>
-          <w:b w:val="0"/>
-          <w:i/>
-          <w:sz w:val="17"/>
-        </w:rPr>
-        <w:t>연쇄 태깅 (387 대상): recall 67.7% · TP 위 80.6%. 허위 POI(Point of Interest — 지도에 존재하지 않는 가게가 등록되는 것) 69/96(72%): 간판이 아닌 크롭 96개 중 69개에 업종 태그가 붙었습니다. 태깅 모델에게 “unknown” 을 허용했고, 그 결과 96개 중 27개는 스스로 걸렀습니다. 대신 진짜 간판 325개 중 22개에도 unknown 으로 답해 오답 처리됐습니다.</w:t>
-      </w:r>
-    </w:p>
-    <w:p>
-      <w:r>
-        <w:rPr>
-          <w:b w:val="0"/>
-          <w:i/>
-          <w:sz w:val="17"/>
-        </w:rPr>
-        <w:t>구성 A vs B — 차이는 OCR recall 1.7 pp(64.5 vs 62.8), 태깅 recall 0 pp(둘 다 67.7), 허위 POI 2건(69 vs 67)으로, confidence interval 없이 차이로 읽지 않습니다. 표 2 에서 두 word detector 가 구분되지 않은 것과 같은 결론이며, 배포는 A 를 유지합니다. 정정: 이전 판의 연쇄 값(OCR 52.5%, 태깅 68.6%, 허위 POI 124/124)은 표 1 과 다른 검출기, 좌표를 오인해 잘못 잘린 크롭 9개, 표 3·4 와 다른 채점기, “unknown” 이 금지된 태깅으로 잰 값이라 대체합니다. 또 어느 fold 에도 속하지 않아 out-of-fold 검출이 없는 사진 2장(간판 10개)을 놓친 것으로 세던 것을 빼서, 표 1·2 와 같은 298장으로 맞췄습니다.</w:t>
-      </w:r>
-    </w:p>
   </w:body>
 </w:document>
 </file>

</xml_diff>

<commit_message>
Tagging GT v2: apply 32 reviewed changes and rescore the cascade tagging
36 suspects (guideline v2 applied to all 256 rows in the confusable groups, from names and
signboard images only) were decided by the user: 32 changed (22 tags, 10 excluded), 4 kept.
v1 kept as tagging_gt_v1.csv. Rescored from saved predictions: A 84.9% (TP), RAG-free 83.6%,
tag-gated 85.2%, B 85.5%; all paired bootstrap intervals include 0. Table 5 tagging rows updated.

Co-Authored-By: Claude Opus 5.5 <noreply@anthropic.com>
</commit_message>
<xml_diff>
--- a/docs/GSV_pipeline_tables.docx
+++ b/docs/GSV_pipeline_tables.docx
@@ -4091,7 +4091,7 @@
               <w:rPr>
                 <w:sz w:val="17"/>
               </w:rPr>
-              <w:t>87.2</w:t>
+              <w:t>88.0</w:t>
             </w:r>
           </w:p>
         </w:tc>
@@ -4107,7 +4107,7 @@
               <w:rPr>
                 <w:sz w:val="17"/>
               </w:rPr>
-              <w:t>70.5</w:t>
+              <w:t>81.1</w:t>
             </w:r>
           </w:p>
         </w:tc>
@@ -4123,7 +4123,7 @@
               <w:rPr>
                 <w:sz w:val="17"/>
               </w:rPr>
-              <w:t>84.6</w:t>
+              <w:t>85.6</w:t>
             </w:r>
           </w:p>
         </w:tc>
@@ -4139,7 +4139,7 @@
               <w:rPr>
                 <w:sz w:val="17"/>
               </w:rPr>
-              <w:t>80.6%</w:t>
+              <w:t>84.9%</w:t>
             </w:r>
           </w:p>
         </w:tc>
@@ -4457,7 +4457,7 @@
               <w:rPr>
                 <w:sz w:val="17"/>
               </w:rPr>
-              <w:t>86.2</w:t>
+              <w:t>88.0</w:t>
             </w:r>
           </w:p>
         </w:tc>
@@ -4473,7 +4473,7 @@
               <w:rPr>
                 <w:sz w:val="17"/>
               </w:rPr>
-              <w:t>69.6</w:t>
+              <w:t>81.1</w:t>
             </w:r>
           </w:p>
         </w:tc>
@@ -4489,7 +4489,7 @@
               <w:rPr>
                 <w:sz w:val="17"/>
               </w:rPr>
-              <w:t>86.5</w:t>
+              <w:t>87.5</w:t>
             </w:r>
           </w:p>
         </w:tc>
@@ -4505,7 +4505,7 @@
               <w:rPr>
                 <w:sz w:val="17"/>
               </w:rPr>
-              <w:t>80.6%</w:t>
+              <w:t>85.5%</w:t>
             </w:r>
           </w:p>
         </w:tc>

</xml_diff>

<commit_message>
Word Table 5: OCR rows as line exact / CER for A and B
Co-Authored-By: Claude Opus 5.5 <noreply@anthropic.com>
</commit_message>
<xml_diff>
--- a/docs/GSV_pipeline_tables.docx
+++ b/docs/GSV_pipeline_tables.docx
@@ -3647,7 +3647,7 @@
           <w:b/>
           <w:sz w:val="22"/>
         </w:rPr>
-        <w:t>Table 5. End-to-end pipeline, configurations A and B: GSV photo → signboard detection → word detection → SVTRv2-B → Gemma 4 31B fix → Gemma 4 31B tagging (298 photos; line exact % / tagging accuracy %)</w:t>
+        <w:t>Table 5. End-to-end pipeline, configurations A and B: GSV photo → signboard detection → word detection → SVTRv2-B → Gemma 4 31B fix → Gemma 4 31B tagging (298 photos; OCR rows: line exact % / CER, tagging rows: accuracy %, false POI: counts)</w:t>
       </w:r>
     </w:p>
     <w:tbl>
@@ -3658,17 +3658,17 @@
         <w:tblLook w:firstColumn="1" w:firstRow="1" w:lastColumn="0" w:lastRow="0" w:noHBand="0" w:noVBand="1" w:val="04A0"/>
       </w:tblPr>
       <w:tblGrid>
-        <w:gridCol w:w="1584"/>
-        <w:gridCol w:w="3168"/>
-        <w:gridCol w:w="1296"/>
-        <w:gridCol w:w="1296"/>
-        <w:gridCol w:w="1296"/>
-        <w:gridCol w:w="1296"/>
+        <w:gridCol w:w="1440"/>
+        <w:gridCol w:w="2880"/>
+        <w:gridCol w:w="1512"/>
+        <w:gridCol w:w="1512"/>
+        <w:gridCol w:w="1512"/>
+        <w:gridCol w:w="1656"/>
       </w:tblGrid>
       <w:tr>
         <w:tc>
           <w:tcPr>
-            <w:tcW w:type="dxa" w:w="1584"/>
+            <w:tcW w:type="dxa" w:w="1440"/>
           </w:tcPr>
           <w:p>
             <w:pPr>
@@ -3685,7 +3685,7 @@
         </w:tc>
         <w:tc>
           <w:tcPr>
-            <w:tcW w:type="dxa" w:w="3168"/>
+            <w:tcW w:type="dxa" w:w="2880"/>
           </w:tcPr>
           <w:p>
             <w:pPr>
@@ -3702,7 +3702,7 @@
         </w:tc>
         <w:tc>
           <w:tcPr>
-            <w:tcW w:type="dxa" w:w="1296"/>
+            <w:tcW w:type="dxa" w:w="1512"/>
           </w:tcPr>
           <w:p>
             <w:pPr>
@@ -3719,7 +3719,7 @@
         </w:tc>
         <w:tc>
           <w:tcPr>
-            <w:tcW w:type="dxa" w:w="1296"/>
+            <w:tcW w:type="dxa" w:w="1512"/>
           </w:tcPr>
           <w:p>
             <w:pPr>
@@ -3736,7 +3736,7 @@
         </w:tc>
         <w:tc>
           <w:tcPr>
-            <w:tcW w:type="dxa" w:w="1296"/>
+            <w:tcW w:type="dxa" w:w="1512"/>
           </w:tcPr>
           <w:p>
             <w:pPr>
@@ -3753,7 +3753,7 @@
         </w:tc>
         <w:tc>
           <w:tcPr>
-            <w:tcW w:type="dxa" w:w="1296"/>
+            <w:tcW w:type="dxa" w:w="1656"/>
           </w:tcPr>
           <w:p>
             <w:pPr>
@@ -3772,7 +3772,7 @@
       <w:tr>
         <w:tc>
           <w:tcPr>
-            <w:tcW w:type="dxa" w:w="1584"/>
+            <w:tcW w:type="dxa" w:w="1440"/>
           </w:tcPr>
           <w:p>
             <w:pPr>
@@ -3788,7 +3788,7 @@
         </w:tc>
         <w:tc>
           <w:tcPr>
-            <w:tcW w:type="dxa" w:w="3168"/>
+            <w:tcW w:type="dxa" w:w="2880"/>
           </w:tcPr>
           <w:p>
             <w:pPr>
@@ -3804,7 +3804,7 @@
         </w:tc>
         <w:tc>
           <w:tcPr>
-            <w:tcW w:type="dxa" w:w="1296"/>
+            <w:tcW w:type="dxa" w:w="1512"/>
           </w:tcPr>
           <w:p>
             <w:pPr>
@@ -3820,7 +3820,7 @@
         </w:tc>
         <w:tc>
           <w:tcPr>
-            <w:tcW w:type="dxa" w:w="1296"/>
+            <w:tcW w:type="dxa" w:w="1512"/>
           </w:tcPr>
           <w:p>
             <w:pPr>
@@ -3836,7 +3836,7 @@
         </w:tc>
         <w:tc>
           <w:tcPr>
-            <w:tcW w:type="dxa" w:w="1296"/>
+            <w:tcW w:type="dxa" w:w="1512"/>
           </w:tcPr>
           <w:p>
             <w:pPr>
@@ -3852,7 +3852,7 @@
         </w:tc>
         <w:tc>
           <w:tcPr>
-            <w:tcW w:type="dxa" w:w="1296"/>
+            <w:tcW w:type="dxa" w:w="1656"/>
           </w:tcPr>
           <w:p>
             <w:pPr>
@@ -3870,7 +3870,7 @@
       <w:tr>
         <w:tc>
           <w:tcPr>
-            <w:tcW w:type="dxa" w:w="1584"/>
+            <w:tcW w:type="dxa" w:w="1440"/>
             <w:vMerge w:val="restart"/>
           </w:tcPr>
           <w:p>
@@ -3887,7 +3887,7 @@
         </w:tc>
         <w:tc>
           <w:tcPr>
-            <w:tcW w:type="dxa" w:w="3168"/>
+            <w:tcW w:type="dxa" w:w="2880"/>
           </w:tcPr>
           <w:p>
             <w:pPr>
@@ -3897,13 +3897,13 @@
               <w:rPr>
                 <w:sz w:val="17"/>
               </w:rPr>
-              <w:t>OCR line exact — on correctly detected signboards (TP)</w:t>
+              <w:t>OCR line exact / CER — on correctly detected signboards (TP)</w:t>
             </w:r>
           </w:p>
         </w:tc>
         <w:tc>
           <w:tcPr>
-            <w:tcW w:type="dxa" w:w="1296"/>
+            <w:tcW w:type="dxa" w:w="1512"/>
           </w:tcPr>
           <w:p>
             <w:pPr>
@@ -3913,13 +3913,13 @@
               <w:rPr>
                 <w:sz w:val="17"/>
               </w:rPr>
-              <w:t>77.1</w:t>
+              <w:t>77.1 / 0.257</w:t>
             </w:r>
           </w:p>
         </w:tc>
         <w:tc>
           <w:tcPr>
-            <w:tcW w:type="dxa" w:w="1296"/>
+            <w:tcW w:type="dxa" w:w="1512"/>
           </w:tcPr>
           <w:p>
             <w:pPr>
@@ -3929,13 +3929,13 @@
               <w:rPr>
                 <w:sz w:val="17"/>
               </w:rPr>
-              <w:t>76.5</w:t>
+              <w:t>76.5 / 0.178</w:t>
             </w:r>
           </w:p>
         </w:tc>
         <w:tc>
           <w:tcPr>
-            <w:tcW w:type="dxa" w:w="1296"/>
+            <w:tcW w:type="dxa" w:w="1512"/>
           </w:tcPr>
           <w:p>
             <w:pPr>
@@ -3945,13 +3945,13 @@
               <w:rPr>
                 <w:sz w:val="17"/>
               </w:rPr>
-              <w:t>78.1</w:t>
+              <w:t>78.1 / 0.292</w:t>
             </w:r>
           </w:p>
         </w:tc>
         <w:tc>
           <w:tcPr>
-            <w:tcW w:type="dxa" w:w="1296"/>
+            <w:tcW w:type="dxa" w:w="1656"/>
           </w:tcPr>
           <w:p>
             <w:pPr>
@@ -3961,7 +3961,7 @@
               <w:rPr>
                 <w:sz w:val="17"/>
               </w:rPr>
-              <w:t>77.2%</w:t>
+              <w:t>77.2% / 0.223</w:t>
             </w:r>
           </w:p>
         </w:tc>
@@ -3976,7 +3976,7 @@
         </w:tc>
         <w:tc>
           <w:tcPr>
-            <w:tcW w:type="dxa" w:w="3168"/>
+            <w:tcW w:type="dxa" w:w="2880"/>
           </w:tcPr>
           <w:p>
             <w:pPr>
@@ -3986,13 +3986,13 @@
               <w:rPr>
                 <w:sz w:val="17"/>
               </w:rPr>
-              <w:t>OCR line exact — on GT signboards (detection perfect)</w:t>
+              <w:t>OCR line exact / CER — on GT signboards (detection perfect)</w:t>
             </w:r>
           </w:p>
         </w:tc>
         <w:tc>
           <w:tcPr>
-            <w:tcW w:type="dxa" w:w="1296"/>
+            <w:tcW w:type="dxa" w:w="1512"/>
           </w:tcPr>
           <w:p>
             <w:pPr>
@@ -4002,13 +4002,13 @@
               <w:rPr>
                 <w:sz w:val="17"/>
               </w:rPr>
-              <w:t>83.0</w:t>
+              <w:t>83.0 / 0.157</w:t>
             </w:r>
           </w:p>
         </w:tc>
         <w:tc>
           <w:tcPr>
-            <w:tcW w:type="dxa" w:w="1296"/>
+            <w:tcW w:type="dxa" w:w="1512"/>
           </w:tcPr>
           <w:p>
             <w:pPr>
@@ -4018,13 +4018,13 @@
               <w:rPr>
                 <w:sz w:val="17"/>
               </w:rPr>
-              <w:t>88.7</w:t>
+              <w:t>88.7 / 0.082</w:t>
             </w:r>
           </w:p>
         </w:tc>
         <w:tc>
           <w:tcPr>
-            <w:tcW w:type="dxa" w:w="1296"/>
+            <w:tcW w:type="dxa" w:w="1512"/>
           </w:tcPr>
           <w:p>
             <w:pPr>
@@ -4034,13 +4034,13 @@
               <w:rPr>
                 <w:sz w:val="17"/>
               </w:rPr>
-              <w:t>79.0</w:t>
+              <w:t>79.0 / 0.163</w:t>
             </w:r>
           </w:p>
         </w:tc>
         <w:tc>
           <w:tcPr>
-            <w:tcW w:type="dxa" w:w="1296"/>
+            <w:tcW w:type="dxa" w:w="1656"/>
           </w:tcPr>
           <w:p>
             <w:pPr>
@@ -4050,7 +4050,7 @@
               <w:rPr>
                 <w:sz w:val="17"/>
               </w:rPr>
-              <w:t>83.6%</w:t>
+              <w:t>83.6% / 0.121</w:t>
             </w:r>
           </w:p>
         </w:tc>
@@ -4065,7 +4065,7 @@
         </w:tc>
         <w:tc>
           <w:tcPr>
-            <w:tcW w:type="dxa" w:w="3168"/>
+            <w:tcW w:type="dxa" w:w="2880"/>
           </w:tcPr>
           <w:p>
             <w:pPr>
@@ -4081,7 +4081,7 @@
         </w:tc>
         <w:tc>
           <w:tcPr>
-            <w:tcW w:type="dxa" w:w="1296"/>
+            <w:tcW w:type="dxa" w:w="1512"/>
           </w:tcPr>
           <w:p>
             <w:pPr>
@@ -4097,7 +4097,7 @@
         </w:tc>
         <w:tc>
           <w:tcPr>
-            <w:tcW w:type="dxa" w:w="1296"/>
+            <w:tcW w:type="dxa" w:w="1512"/>
           </w:tcPr>
           <w:p>
             <w:pPr>
@@ -4113,7 +4113,7 @@
         </w:tc>
         <w:tc>
           <w:tcPr>
-            <w:tcW w:type="dxa" w:w="1296"/>
+            <w:tcW w:type="dxa" w:w="1512"/>
           </w:tcPr>
           <w:p>
             <w:pPr>
@@ -4129,7 +4129,7 @@
         </w:tc>
         <w:tc>
           <w:tcPr>
-            <w:tcW w:type="dxa" w:w="1296"/>
+            <w:tcW w:type="dxa" w:w="1656"/>
           </w:tcPr>
           <w:p>
             <w:pPr>
@@ -4154,7 +4154,7 @@
         </w:tc>
         <w:tc>
           <w:tcPr>
-            <w:tcW w:type="dxa" w:w="3168"/>
+            <w:tcW w:type="dxa" w:w="2880"/>
           </w:tcPr>
           <w:p>
             <w:pPr>
@@ -4170,7 +4170,7 @@
         </w:tc>
         <w:tc>
           <w:tcPr>
-            <w:tcW w:type="dxa" w:w="1296"/>
+            <w:tcW w:type="dxa" w:w="1512"/>
           </w:tcPr>
           <w:p>
             <w:pPr>
@@ -4186,7 +4186,7 @@
         </w:tc>
         <w:tc>
           <w:tcPr>
-            <w:tcW w:type="dxa" w:w="1296"/>
+            <w:tcW w:type="dxa" w:w="1512"/>
           </w:tcPr>
           <w:p>
             <w:pPr>
@@ -4202,7 +4202,7 @@
         </w:tc>
         <w:tc>
           <w:tcPr>
-            <w:tcW w:type="dxa" w:w="1296"/>
+            <w:tcW w:type="dxa" w:w="1512"/>
           </w:tcPr>
           <w:p>
             <w:pPr>
@@ -4218,7 +4218,7 @@
         </w:tc>
         <w:tc>
           <w:tcPr>
-            <w:tcW w:type="dxa" w:w="1296"/>
+            <w:tcW w:type="dxa" w:w="1656"/>
           </w:tcPr>
           <w:p>
             <w:pPr>
@@ -4236,7 +4236,7 @@
       <w:tr>
         <w:tc>
           <w:tcPr>
-            <w:tcW w:type="dxa" w:w="1584"/>
+            <w:tcW w:type="dxa" w:w="1440"/>
             <w:vMerge w:val="restart"/>
           </w:tcPr>
           <w:p>
@@ -4253,7 +4253,7 @@
         </w:tc>
         <w:tc>
           <w:tcPr>
-            <w:tcW w:type="dxa" w:w="3168"/>
+            <w:tcW w:type="dxa" w:w="2880"/>
           </w:tcPr>
           <w:p>
             <w:pPr>
@@ -4263,13 +4263,13 @@
               <w:rPr>
                 <w:sz w:val="17"/>
               </w:rPr>
-              <w:t>OCR line exact — on correctly detected signboards (TP)</w:t>
+              <w:t>OCR line exact / CER — on correctly detected signboards (TP)</w:t>
             </w:r>
           </w:p>
         </w:tc>
         <w:tc>
           <w:tcPr>
-            <w:tcW w:type="dxa" w:w="1296"/>
+            <w:tcW w:type="dxa" w:w="1512"/>
           </w:tcPr>
           <w:p>
             <w:pPr>
@@ -4279,13 +4279,13 @@
               <w:rPr>
                 <w:sz w:val="17"/>
               </w:rPr>
-              <w:t>75.9</w:t>
+              <w:t>75.9 / 0.277</w:t>
             </w:r>
           </w:p>
         </w:tc>
         <w:tc>
           <w:tcPr>
-            <w:tcW w:type="dxa" w:w="1296"/>
+            <w:tcW w:type="dxa" w:w="1512"/>
           </w:tcPr>
           <w:p>
             <w:pPr>
@@ -4295,13 +4295,13 @@
               <w:rPr>
                 <w:sz w:val="17"/>
               </w:rPr>
-              <w:t>74.1</w:t>
+              <w:t>74.1 / 0.194</w:t>
             </w:r>
           </w:p>
         </w:tc>
         <w:tc>
           <w:tcPr>
-            <w:tcW w:type="dxa" w:w="1296"/>
+            <w:tcW w:type="dxa" w:w="1512"/>
           </w:tcPr>
           <w:p>
             <w:pPr>
@@ -4311,13 +4311,13 @@
               <w:rPr>
                 <w:sz w:val="17"/>
               </w:rPr>
-              <w:t>75.3</w:t>
+              <w:t>75.3 / 0.312</w:t>
             </w:r>
           </w:p>
         </w:tc>
         <w:tc>
           <w:tcPr>
-            <w:tcW w:type="dxa" w:w="1296"/>
+            <w:tcW w:type="dxa" w:w="1656"/>
           </w:tcPr>
           <w:p>
             <w:pPr>
@@ -4327,7 +4327,7 @@
               <w:rPr>
                 <w:sz w:val="17"/>
               </w:rPr>
-              <w:t>75.1%</w:t>
+              <w:t>75.1% / 0.241</w:t>
             </w:r>
           </w:p>
         </w:tc>
@@ -4342,7 +4342,7 @@
         </w:tc>
         <w:tc>
           <w:tcPr>
-            <w:tcW w:type="dxa" w:w="3168"/>
+            <w:tcW w:type="dxa" w:w="2880"/>
           </w:tcPr>
           <w:p>
             <w:pPr>
@@ -4352,13 +4352,13 @@
               <w:rPr>
                 <w:sz w:val="17"/>
               </w:rPr>
-              <w:t>OCR line exact — on GT signboards (detection perfect)</w:t>
+              <w:t>OCR line exact / CER — on GT signboards (detection perfect)</w:t>
             </w:r>
           </w:p>
         </w:tc>
         <w:tc>
           <w:tcPr>
-            <w:tcW w:type="dxa" w:w="1296"/>
+            <w:tcW w:type="dxa" w:w="1512"/>
           </w:tcPr>
           <w:p>
             <w:pPr>
@@ -4368,13 +4368,13 @@
               <w:rPr>
                 <w:sz w:val="17"/>
               </w:rPr>
-              <w:t>83.5</w:t>
+              <w:t>83.5 / 0.178</w:t>
             </w:r>
           </w:p>
         </w:tc>
         <w:tc>
           <w:tcPr>
-            <w:tcW w:type="dxa" w:w="1296"/>
+            <w:tcW w:type="dxa" w:w="1512"/>
           </w:tcPr>
           <w:p>
             <w:pPr>
@@ -4384,13 +4384,13 @@
               <w:rPr>
                 <w:sz w:val="17"/>
               </w:rPr>
-              <w:t>85.6</w:t>
+              <w:t>85.6 / 0.084</w:t>
             </w:r>
           </w:p>
         </w:tc>
         <w:tc>
           <w:tcPr>
-            <w:tcW w:type="dxa" w:w="1296"/>
+            <w:tcW w:type="dxa" w:w="1512"/>
           </w:tcPr>
           <w:p>
             <w:pPr>
@@ -4400,13 +4400,13 @@
               <w:rPr>
                 <w:sz w:val="17"/>
               </w:rPr>
-              <w:t>77.9</w:t>
+              <w:t>77.9 / 0.188</w:t>
             </w:r>
           </w:p>
         </w:tc>
         <w:tc>
           <w:tcPr>
-            <w:tcW w:type="dxa" w:w="1296"/>
+            <w:tcW w:type="dxa" w:w="1656"/>
           </w:tcPr>
           <w:p>
             <w:pPr>
@@ -4416,7 +4416,7 @@
               <w:rPr>
                 <w:sz w:val="17"/>
               </w:rPr>
-              <w:t>82.4%</w:t>
+              <w:t>82.4% / 0.133</w:t>
             </w:r>
           </w:p>
         </w:tc>
@@ -4431,7 +4431,7 @@
         </w:tc>
         <w:tc>
           <w:tcPr>
-            <w:tcW w:type="dxa" w:w="3168"/>
+            <w:tcW w:type="dxa" w:w="2880"/>
           </w:tcPr>
           <w:p>
             <w:pPr>
@@ -4447,7 +4447,7 @@
         </w:tc>
         <w:tc>
           <w:tcPr>
-            <w:tcW w:type="dxa" w:w="1296"/>
+            <w:tcW w:type="dxa" w:w="1512"/>
           </w:tcPr>
           <w:p>
             <w:pPr>
@@ -4463,7 +4463,7 @@
         </w:tc>
         <w:tc>
           <w:tcPr>
-            <w:tcW w:type="dxa" w:w="1296"/>
+            <w:tcW w:type="dxa" w:w="1512"/>
           </w:tcPr>
           <w:p>
             <w:pPr>
@@ -4479,7 +4479,7 @@
         </w:tc>
         <w:tc>
           <w:tcPr>
-            <w:tcW w:type="dxa" w:w="1296"/>
+            <w:tcW w:type="dxa" w:w="1512"/>
           </w:tcPr>
           <w:p>
             <w:pPr>
@@ -4495,7 +4495,7 @@
         </w:tc>
         <w:tc>
           <w:tcPr>
-            <w:tcW w:type="dxa" w:w="1296"/>
+            <w:tcW w:type="dxa" w:w="1656"/>
           </w:tcPr>
           <w:p>
             <w:pPr>
@@ -4520,7 +4520,7 @@
         </w:tc>
         <w:tc>
           <w:tcPr>
-            <w:tcW w:type="dxa" w:w="3168"/>
+            <w:tcW w:type="dxa" w:w="2880"/>
           </w:tcPr>
           <w:p>
             <w:pPr>
@@ -4536,7 +4536,7 @@
         </w:tc>
         <w:tc>
           <w:tcPr>
-            <w:tcW w:type="dxa" w:w="1296"/>
+            <w:tcW w:type="dxa" w:w="1512"/>
           </w:tcPr>
           <w:p>
             <w:pPr>
@@ -4552,7 +4552,7 @@
         </w:tc>
         <w:tc>
           <w:tcPr>
-            <w:tcW w:type="dxa" w:w="1296"/>
+            <w:tcW w:type="dxa" w:w="1512"/>
           </w:tcPr>
           <w:p>
             <w:pPr>
@@ -4568,7 +4568,7 @@
         </w:tc>
         <w:tc>
           <w:tcPr>
-            <w:tcW w:type="dxa" w:w="1296"/>
+            <w:tcW w:type="dxa" w:w="1512"/>
           </w:tcPr>
           <w:p>
             <w:pPr>
@@ -4584,7 +4584,7 @@
         </w:tc>
         <w:tc>
           <w:tcPr>
-            <w:tcW w:type="dxa" w:w="1296"/>
+            <w:tcW w:type="dxa" w:w="1656"/>
           </w:tcPr>
           <w:p>
             <w:pPr>

</xml_diff>